<commit_message>
25/9 Mass Export Function
</commit_message>
<xml_diff>
--- a/docs/user-guides/manuals/user-manual-soc-analyst-tier2.th.docx
+++ b/docs/user-guides/manuals/user-manual-soc-analyst-tier2.th.docx
@@ -2086,6 +2086,117 @@
           <w:szCs w:val="32"/>
         </w:rPr>
         <w:t xml:space="preserve">ของป้าย หน้าถัดไป และหัวคอลัมน์ คงเงื่อนไขทั้งหมดไว้ คัดลอกที่อยู่ในเบราว์เซอร์ส่งให้เพื่อนร่วมทีมเพื่อเปิดมุมมองเดียวกันได้</w:t>
+      </w:r>
+    </w:p>
+    <w:p>
+      <w:pPr>
+        <w:pStyle w:val="ListParagraph"/>
+        <w:numPr>
+          <w:ilvl w:val="0"/>
+          <w:numId w:val="2"/>
+        </w:numPr>
+        <w:spacing w:after="60"/>
+      </w:pPr>
+      <w:r>
+        <w:rPr>
+          <w:b/>
+          <w:bCs/>
+          <w:sz w:val="32"/>
+          <w:szCs w:val="32"/>
+        </w:rPr>
+        <w:t xml:space="preserve">ส่งออกรายงานทั้งรายการ: </w:t>
+      </w:r>
+      <w:r>
+        <w:rPr>
+          <w:sz w:val="32"/>
+          <w:szCs w:val="32"/>
+        </w:rPr>
+        <w:t xml:space="preserve">ในหน้า </w:t>
+      </w:r>
+      <w:r>
+        <w:rPr>
+          <w:b/>
+          <w:bCs/>
+          <w:color w:val="245EA8"/>
+          <w:sz w:val="32"/>
+          <w:szCs w:val="32"/>
+        </w:rPr>
+        <w:t xml:space="preserve">เคสที่กำลังดำเนินการอยู่</w:t>
+      </w:r>
+      <w:r>
+        <w:rPr>
+          <w:sz w:val="32"/>
+          <w:szCs w:val="32"/>
+        </w:rPr>
+        <w:t xml:space="preserve"> และ </w:t>
+      </w:r>
+      <w:r>
+        <w:rPr>
+          <w:b/>
+          <w:bCs/>
+          <w:color w:val="245EA8"/>
+          <w:sz w:val="32"/>
+          <w:szCs w:val="32"/>
+        </w:rPr>
+        <w:t xml:space="preserve">ประวัติเคสที่ปิดไปแล้ว</w:t>
+      </w:r>
+      <w:r>
+        <w:rPr>
+          <w:sz w:val="32"/>
+          <w:szCs w:val="32"/>
+        </w:rPr>
+        <w:t xml:space="preserve"> ปุ่ม </w:t>
+      </w:r>
+      <w:r>
+        <w:rPr>
+          <w:b/>
+          <w:bCs/>
+          <w:color w:val="1F2D3D"/>
+          <w:sz w:val="32"/>
+          <w:szCs w:val="32"/>
+        </w:rPr>
+        <w:t xml:space="preserve">ส่งออก PDF (N)</w:t>
+      </w:r>
+      <w:r>
+        <w:rPr>
+          <w:sz w:val="32"/>
+          <w:szCs w:val="32"/>
+        </w:rPr>
+        <w:t xml:space="preserve"> ในแถบผลลัพธ์ดาวน์โหลดรายงาน PDF ของทุกเคสที่รายการแสดงอยู่ (ทุกหน้า ตามลำดับเดียวกัน) เป็นไฟล์ ZIP — หนึ่งไฟล์ต่อเคส ชื่อและเนื้อหาเหมือนการออกรายงานทีละเคส เลือก </w:t>
+      </w:r>
+      <w:r>
+        <w:rPr>
+          <w:b/>
+          <w:bCs/>
+          <w:color w:val="1F2D3D"/>
+          <w:sz w:val="32"/>
+          <w:szCs w:val="32"/>
+        </w:rPr>
+        <w:t xml:space="preserve">ซ่อนช่องที่ว่าง</w:t>
+      </w:r>
+      <w:r>
+        <w:rPr>
+          <w:sz w:val="32"/>
+          <w:szCs w:val="32"/>
+        </w:rPr>
+        <w:t xml:space="preserve"> / </w:t>
+      </w:r>
+      <w:r>
+        <w:rPr>
+          <w:b/>
+          <w:bCs/>
+          <w:color w:val="1F2D3D"/>
+          <w:sz w:val="32"/>
+          <w:szCs w:val="32"/>
+        </w:rPr>
+        <w:t xml:space="preserve">แสดงช่องลงนาม</w:t>
+      </w:r>
+      <w:r>
+        <w:rPr>
+          <w:sz w:val="32"/>
+          <w:szCs w:val="32"/>
+        </w:rPr>
+        <w:t xml:space="preserve"> ได้ก่อนกด ดาวน์โหลด ZIP ส่งออกได้ครั้งละไม่เกิน 100 เคส — ถ้าเกินให้กรองให้แคบลง เช่น ใช้ช่วงวันที่ที่สั้นลง ระบบบันทึกว่าคุณเป็นผู้ออกรายงานของแต่ละเคสเหมือนการส่งออกทีละเคส และถ้ามีเคสที่สร้างรายงานไม่สำเร็จ จะมีไฟล์ข้อความใน ZIP บอกเลขเคสนั้น</w:t>
       </w:r>
     </w:p>
     <w:p>

</xml_diff>